<commit_message>
Polish v1.2.0 Summary: styled View Summary button, chart axis fixes, notes
- General Information: "LCCA Summary:" label (B44) and dark "View Summary"
  button cell (D44) styled like the Summary buttons, replacing plain text
- Summary charts 1 and 3: category labels moved below the negative salvage
  bars; chart 2 rate axis shown as percent
- Change notes rewritten for the self-contained build (no Output.bas import)
- Diff, change record, deck and MBT render regenerated

Co-Authored-By: Claude Fable 5.1 <noreply@anthropic.com>
Claude-Session: https://claude.ai/code/session_01JrCXNd278qC95SDvCCWbYM
</commit_message>
<xml_diff>
--- a/tdot-lcca/TDOT_LCCA_v1.2.0_Technical_Change_Record.docx
+++ b/tdot-lcca/TDOT_LCCA_v1.2.0_Technical_Change_Record.docx
@@ -493,7 +493,7 @@
                 <w:sz w:val="14"/>
                 <w:szCs w:val="14"/>
               </w:rPr>
-              <w:t xml:space="preserve">ca9080b777c4ab7f3567c01c55ae1b75f9911c30d70192dd9ce3a1dbd89d2c94</w:t>
+              <w:t xml:space="preserve">68da37c3f338cf181eddfaa93763fb9136b3607b07e8770148f4895d99f7296b</w:t>
             </w:r>
           </w:p>
         </w:tc>
@@ -7219,7 +7219,7 @@
                 <w:sz w:val="14"/>
                 <w:szCs w:val="14"/>
               </w:rPr>
-              <w:t xml:space="preserve">"General Information" and "Instructions" buttons on Summary; "View Summary" under Alternative Setup</w:t>
+              <w:t xml:space="preserve">"General Information" and "Instructions" buttons on Summary; "LCCA Summary: View Summary" button under Alternative Setup on General Information (B44, D44)</w:t>
             </w:r>
           </w:p>
         </w:tc>
@@ -13378,7 +13378,7 @@
         <w:spacing w:after="120" w:before="280"/>
       </w:pPr>
       <w:r>
-        <w:t xml:space="preserve">A.2 General Information (3 cells)</w:t>
+        <w:t xml:space="preserve">A.2 General Information (4 cells)</w:t>
       </w:r>
     </w:p>
     <w:tbl>
@@ -13680,7 +13680,91 @@
                 <w:sz w:val="13"/>
                 <w:szCs w:val="13"/>
               </w:rPr>
-              <w:t xml:space="preserve">B43</w:t>
+              <w:t xml:space="preserve">B44</w:t>
+            </w:r>
+          </w:p>
+        </w:tc>
+        <w:tc>
+          <w:tcPr>
+            <w:tcW w:type="dxa" w:w="3400"/>
+            <w:tcMar>
+              <w:top w:type="dxa" w:w="40"/>
+              <w:left w:type="dxa" w:w="80"/>
+              <w:bottom w:type="dxa" w:w="40"/>
+              <w:right w:type="dxa" w:w="80"/>
+            </w:tcMar>
+          </w:tcPr>
+          <w:p>
+            <w:pPr>
+              <w:spacing w:after="0"/>
+            </w:pPr>
+            <w:r>
+              <w:rPr>
+                <w:rFonts w:ascii="Courier New" w:cs="Courier New" w:eastAsia="Courier New" w:hAnsi="Courier New"/>
+                <w:b w:val="false"/>
+                <w:bCs w:val="false"/>
+                <w:sz w:val="13"/>
+                <w:szCs w:val="13"/>
+              </w:rPr>
+              <w:t xml:space="preserve">(empty)</w:t>
+            </w:r>
+          </w:p>
+        </w:tc>
+        <w:tc>
+          <w:tcPr>
+            <w:tcW w:type="dxa" w:w="4660"/>
+            <w:tcMar>
+              <w:top w:type="dxa" w:w="40"/>
+              <w:left w:type="dxa" w:w="80"/>
+              <w:bottom w:type="dxa" w:w="40"/>
+              <w:right w:type="dxa" w:w="80"/>
+            </w:tcMar>
+          </w:tcPr>
+          <w:p>
+            <w:pPr>
+              <w:spacing w:after="0"/>
+            </w:pPr>
+            <w:r>
+              <w:rPr>
+                <w:rFonts w:ascii="Courier New" w:cs="Courier New" w:eastAsia="Courier New" w:hAnsi="Courier New"/>
+                <w:b w:val="false"/>
+                <w:bCs w:val="false"/>
+                <w:sz w:val="13"/>
+                <w:szCs w:val="13"/>
+              </w:rPr>
+              <w:t xml:space="preserve">LCCA Summary:</w:t>
+            </w:r>
+          </w:p>
+        </w:tc>
+      </w:tr>
+      <w:tr>
+        <w:trPr>
+          <w:cantSplit/>
+          <w:tblHeader w:val="false"/>
+        </w:trPr>
+        <w:tc>
+          <w:tcPr>
+            <w:tcW w:type="dxa" w:w="1300"/>
+            <w:tcMar>
+              <w:top w:type="dxa" w:w="40"/>
+              <w:left w:type="dxa" w:w="80"/>
+              <w:bottom w:type="dxa" w:w="40"/>
+              <w:right w:type="dxa" w:w="80"/>
+            </w:tcMar>
+          </w:tcPr>
+          <w:p>
+            <w:pPr>
+              <w:spacing w:after="0"/>
+            </w:pPr>
+            <w:r>
+              <w:rPr>
+                <w:rFonts w:ascii="Calibri" w:cs="Calibri" w:eastAsia="Calibri" w:hAnsi="Calibri"/>
+                <w:b w:val="false"/>
+                <w:bCs w:val="false"/>
+                <w:sz w:val="13"/>
+                <w:szCs w:val="13"/>
+              </w:rPr>
+              <w:t xml:space="preserve">D44</w:t>
             </w:r>
           </w:p>
         </w:tc>

</xml_diff>

<commit_message>
Scripted click-through of v1.2.0; period-aware closure days; verdict wording
- Summary Q column counts closure days inside the analysis period (by-year
  block), falling back to F4:F10 when lost revenue is off
- Verdict line reads "only one alternative so far" instead of margin $0
- verification/uno_walkthrough.py drives LibreOffice through the UNO API:
  follows every button, changes rate, period, indirect flag, airport, and
  removes alternatives; report saved alongside
- Change record, deck and notes updated with the click-through results

Co-Authored-By: Claude Fable 5.1 <noreply@anthropic.com>
Claude-Session: https://claude.ai/code/session_01JrCXNd278qC95SDvCCWbYM
</commit_message>
<xml_diff>
--- a/tdot-lcca/TDOT_LCCA_v1.2.0_Technical_Change_Record.docx
+++ b/tdot-lcca/TDOT_LCCA_v1.2.0_Technical_Change_Record.docx
@@ -493,7 +493,7 @@
                 <w:sz w:val="14"/>
                 <w:szCs w:val="14"/>
               </w:rPr>
-              <w:t xml:space="preserve">68da37c3f338cf181eddfaa93763fb9136b3607b07e8770148f4895d99f7296b</w:t>
+              <w:t xml:space="preserve">658bc324ab1f46e5e5f59e92317c991c7e6c3bcc926238123ca95bf98759ccc8</w:t>
             </w:r>
           </w:p>
         </w:tc>
@@ -6741,7 +6741,7 @@
                 <w:sz w:val="14"/>
                 <w:szCs w:val="14"/>
               </w:rPr>
-              <w:t xml:space="preserve">Database!A:D for the names; INDEX/MATCH on "Total" and "Net Present Worth"; SUMIFS over the NPW-table window (rows 37 to 52) on the row labels ("Maintenance*", "Rehabilitation*", "*Indirect*", "Salvage*"); SUM of F4:F10 for closure days</w:t>
+              <w:t xml:space="preserve">Database!A:D for the names; INDEX/MATCH on "Total" and "Net Present Worth"; SUMIFS over the NPW-table window (rows 37 to 52) on the row labels ("Maintenance*", "Rehabilitation*", "*Indirect*", "Salvage*"); closure days = sum of the by-year closure block (indirect cost / daily revenue, years within the analysis period), falling back to SUM of F4:F10 when lost revenue is off</w:t>
             </w:r>
           </w:p>
         </w:tc>
@@ -9497,7 +9497,7 @@
                 <w:sz w:val="15"/>
                 <w:szCs w:val="15"/>
               </w:rPr>
-              <w:t xml:space="preserve">Table reads NPW $8,809,266 and $8,028,734, categories sum to NPW, closure days 57 and 27, flags the winner change at 7 percent; six charts parse in an independent reader and render; on the empty template the sheet reads "No alternatives yet" with no error cells</w:t>
+              <w:t xml:space="preserve">Table reads NPW $8,809,266 and $8,028,734, categories sum to NPW, closure days 57 (HMA) and 9 for PCC in that file (its rehabilitation indirect row is mislabelled, see Appendix C; the v1.2.0 template gives 27), flags the winner change at 7 percent; six charts parse in an independent reader and render; on the empty template the sheet reads "No alternatives yet" with no error cells</w:t>
             </w:r>
           </w:p>
         </w:tc>
@@ -10086,6 +10086,90 @@
                 <w:szCs w:val="15"/>
               </w:rPr>
               <w:t xml:space="preserve">All eight per-project charts and the simulation histogram draw with the intended series, axes and years</w:t>
+            </w:r>
+          </w:p>
+        </w:tc>
+      </w:tr>
+      <w:tr>
+        <w:trPr>
+          <w:cantSplit/>
+          <w:tblHeader w:val="false"/>
+        </w:trPr>
+        <w:tc>
+          <w:tcPr>
+            <w:tcW w:type="dxa" w:w="2300"/>
+            <w:tcMar>
+              <w:top w:type="dxa" w:w="40"/>
+              <w:left w:type="dxa" w:w="80"/>
+              <w:bottom w:type="dxa" w:w="40"/>
+              <w:right w:type="dxa" w:w="80"/>
+            </w:tcMar>
+          </w:tcPr>
+          <w:p>
+            <w:pPr>
+              <w:spacing w:after="0"/>
+            </w:pPr>
+            <w:r>
+              <w:rPr>
+                <w:rFonts w:ascii="Calibri" w:cs="Calibri" w:eastAsia="Calibri" w:hAnsi="Calibri"/>
+                <w:b w:val="false"/>
+                <w:bCs w:val="false"/>
+                <w:sz w:val="15"/>
+                <w:szCs w:val="15"/>
+              </w:rPr>
+              <w:t xml:space="preserve">Scripted click-through</w:t>
+            </w:r>
+          </w:p>
+        </w:tc>
+        <w:tc>
+          <w:tcPr>
+            <w:tcW w:type="dxa" w:w="3000"/>
+            <w:tcMar>
+              <w:top w:type="dxa" w:w="40"/>
+              <w:left w:type="dxa" w:w="80"/>
+              <w:bottom w:type="dxa" w:w="40"/>
+              <w:right w:type="dxa" w:w="80"/>
+            </w:tcMar>
+          </w:tcPr>
+          <w:p>
+            <w:pPr>
+              <w:spacing w:after="0"/>
+            </w:pPr>
+            <w:r>
+              <w:rPr>
+                <w:rFonts w:ascii="Calibri" w:cs="Calibri" w:eastAsia="Calibri" w:hAnsi="Calibri"/>
+                <w:b w:val="false"/>
+                <w:bCs w:val="false"/>
+                <w:sz w:val="15"/>
+                <w:szCs w:val="15"/>
+              </w:rPr>
+              <w:t xml:space="preserve">LibreOffice UNO API: open both workbooks, follow every button target, change discount rate, analysis period, indirect-cost flag and airport, remove alternatives (verification/uno_walkthrough.py)</w:t>
+            </w:r>
+          </w:p>
+        </w:tc>
+        <w:tc>
+          <w:tcPr>
+            <w:tcW w:type="dxa" w:w="4060"/>
+            <w:tcMar>
+              <w:top w:type="dxa" w:w="40"/>
+              <w:left w:type="dxa" w:w="80"/>
+              <w:bottom w:type="dxa" w:w="40"/>
+              <w:right w:type="dxa" w:w="80"/>
+            </w:tcMar>
+          </w:tcPr>
+          <w:p>
+            <w:pPr>
+              <w:spacing w:after="0"/>
+            </w:pPr>
+            <w:r>
+              <w:rPr>
+                <w:rFonts w:ascii="Calibri" w:cs="Calibri" w:eastAsia="Calibri" w:hAnsi="Calibri"/>
+                <w:b w:val="false"/>
+                <w:bCs w:val="false"/>
+                <w:sz w:val="15"/>
+                <w:szCs w:val="15"/>
+              </w:rPr>
+              <w:t xml:space="preserve">All three buttons land on visible sheets; 7 percent flips the verdict to Alternative 1; 20 years drops HMA closures to 43 days and PCC rehabilitation to $0; an unknown airport gives $0 lost revenue with the G2 warning and no error cells; one alternative and none read cleanly</w:t>
             </w:r>
           </w:p>
         </w:tc>
@@ -22905,7 +22989,7 @@
                 <w:sz w:val="12"/>
                 <w:szCs w:val="12"/>
               </w:rPr>
-              <w:t xml:space="preserve">=IF($G4="","",IFERROR(SUM(INDIRECT("'"&amp;$G4&amp;"'!$F$4:$F$10")),0))</w:t>
+              <w:t xml:space="preserve">=IF($G4="","",IF(IFERROR(INDIRECT("'"&amp;$G4&amp;"'!$F$2"),0)&gt;0,SUM($AG$41:$AG$71),IFERROR(SUM(INDIRECT("'"&amp;$G4&amp;"'!$F$4:$F$10")),0)))</w:t>
             </w:r>
           </w:p>
         </w:tc>
@@ -23021,7 +23105,7 @@
                 <w:sz w:val="12"/>
                 <w:szCs w:val="12"/>
               </w:rPr>
-              <w:t xml:space="preserve">=IF(COUNT($O$4:$O$7)=0,"No alternatives yet. Go to General Information and click Alternative Setup.","Lowest present worth: "&amp;INDEX($H$4:$H$7,MATCH(MIN($O$4:$O$7),$O$4:$O$7,0))&amp;"   |   margin to next: "&amp;TEXT(SMALL($O$4:$O$7,MIN(2,COUNT($O$4:$O$7)))-MIN($O$4:$O$7),"$#,##0")&amp;"   |   "&amp;'General Information'!$D$34&amp;"% over "&amp;'General Information'!$D$33&amp;" years   |   lost revenue: "&amp;'General Information'!$D$38)</w:t>
+              <w:t xml:space="preserve">=IF(COUNT($O$4:$O$7)=0,"No alternatives yet. Go to General Information and click Alternative Setup.","Lowest present worth: "&amp;INDEX($H$4:$H$7,MATCH(MIN($O$4:$O$7),$O$4:$O$7,0))&amp;IF(COUNT($O$4:$O$7)&lt;2,"   |   only one alternative so far","   |   margin to next: "&amp;TEXT(SMALL($O$4:$O$7,2)-MIN($O$4:$O$7),"$#,##0"))&amp;"   |   "&amp;'General Information'!$D$34&amp;"% over "&amp;'General Information'!$D$33&amp;" years   |   lost revenue: "&amp;'General Information'!$D$38)</w:t>
             </w:r>
           </w:p>
         </w:tc>
@@ -25575,7 +25659,7 @@
           <w:sz w:val="16"/>
           <w:szCs w:val="16"/>
         </w:rPr>
-        <w:t xml:space="preserve">* In the MBT file the PCC rehabilitation indirect row is labelled "Rehabilitation 1" rather than "Rehabilitation 1 Indirect Cost", so its $159,145 is counted as direct there. The v1.2.0 template label is correct.</w:t>
+        <w:t xml:space="preserve">* In the MBT file the PCC rehabilitation indirect row is labelled "Rehabilitation 1" rather than "Rehabilitation 1 Indirect Cost", so its $159,145 is counted as direct there and its 18 closure days are not counted by the Summary in that file. The v1.2.0 template label is correct.</w:t>
       </w:r>
     </w:p>
     <w:sectPr>

</xml_diff>

<commit_message>
Round-two click-through fixes: deletion-safe Summary, tie wording, Instructions box
- Summary names read the hidden Database sheet through whole-column INDEX,
  so the VBA's row deletion on alternative removal no longer yields #REF!
- Verdict line reads "tied with the next alternative" on a tie
- Instructions step 6 describes the new Summary and View Summary button;
  text box extended to row 76 so the longer text is not clipped
- verification/: package audit script, second and third UNO walkthroughs
  (deletion, tie, four alternatives, dropdown, pay items, page setup)
- Change record, deck and notes updated

Co-Authored-By: Claude Fable 5.1 <noreply@anthropic.com>
Claude-Session: https://claude.ai/code/session_01JrCXNd278qC95SDvCCWbYM
</commit_message>
<xml_diff>
--- a/tdot-lcca/TDOT_LCCA_v1.2.0_Technical_Change_Record.docx
+++ b/tdot-lcca/TDOT_LCCA_v1.2.0_Technical_Change_Record.docx
@@ -493,7 +493,7 @@
                 <w:sz w:val="14"/>
                 <w:szCs w:val="14"/>
               </w:rPr>
-              <w:t xml:space="preserve">658bc324ab1f46e5e5f59e92317c991c7e6c3bcc926238123ca95bf98759ccc8</w:t>
+              <w:t xml:space="preserve">c60aaf177ceac3c8011b1d896a84bfe39ee2cb1d9f93d660151449ad37ab4af4</w:t>
             </w:r>
           </w:p>
         </w:tc>
@@ -5969,7 +5969,7 @@
           <w:sz w:val="22"/>
           <w:szCs w:val="22"/>
         </w:rPr>
-        <w:t xml:space="preserve">The Instructions sheet holds its text in a drawing text box, not in cells. Five runs were changed; the wording of every other run is unchanged.</w:t>
+        <w:t xml:space="preserve">The Instructions sheet holds its text in a drawing text box, not in cells. Six runs were changed; the wording of every other run is unchanged. The text box was extended from row 59 to row 76 because it clips overflow and the text grew by about a third.</w:t>
       </w:r>
     </w:p>
     <w:tbl>
@@ -6496,6 +6496,90 @@
           </w:p>
         </w:tc>
       </w:tr>
+      <w:tr>
+        <w:trPr>
+          <w:cantSplit/>
+          <w:tblHeader w:val="false"/>
+        </w:trPr>
+        <w:tc>
+          <w:tcPr>
+            <w:tcW w:type="dxa" w:w="700"/>
+            <w:tcMar>
+              <w:top w:type="dxa" w:w="40"/>
+              <w:left w:type="dxa" w:w="80"/>
+              <w:bottom w:type="dxa" w:w="40"/>
+              <w:right w:type="dxa" w:w="80"/>
+            </w:tcMar>
+          </w:tcPr>
+          <w:p>
+            <w:pPr>
+              <w:spacing w:after="0"/>
+            </w:pPr>
+            <w:r>
+              <w:rPr>
+                <w:rFonts w:ascii="Calibri" w:cs="Calibri" w:eastAsia="Calibri" w:hAnsi="Calibri"/>
+                <w:b w:val="false"/>
+                <w:bCs w:val="false"/>
+                <w:sz w:val="14"/>
+                <w:szCs w:val="14"/>
+              </w:rPr>
+              <w:t xml:space="preserve">9</w:t>
+            </w:r>
+          </w:p>
+        </w:tc>
+        <w:tc>
+          <w:tcPr>
+            <w:tcW w:type="dxa" w:w="4330"/>
+            <w:tcMar>
+              <w:top w:type="dxa" w:w="40"/>
+              <w:left w:type="dxa" w:w="80"/>
+              <w:bottom w:type="dxa" w:w="40"/>
+              <w:right w:type="dxa" w:w="80"/>
+            </w:tcMar>
+          </w:tcPr>
+          <w:p>
+            <w:pPr>
+              <w:spacing w:after="0"/>
+            </w:pPr>
+            <w:r>
+              <w:rPr>
+                <w:rFonts w:ascii="Calibri" w:cs="Calibri" w:eastAsia="Calibri" w:hAnsi="Calibri"/>
+                <w:b w:val="false"/>
+                <w:bCs w:val="false"/>
+                <w:sz w:val="14"/>
+                <w:szCs w:val="14"/>
+              </w:rPr>
+              <w:t xml:space="preserve">6. Once the pay items and quantities have been filled in, the Net Present Worth (NPW) table and summary graph below the pay items should be automatically filled in for the alternative. The “Summary” worksheet will also automatically fill with alternative costs as the individual alternative worksheets are completed. The Summary worksheet provides a summary table and chart for the initial construction cost and NPW for each included alternative.</w:t>
+            </w:r>
+          </w:p>
+        </w:tc>
+        <w:tc>
+          <w:tcPr>
+            <w:tcW w:type="dxa" w:w="4330"/>
+            <w:tcMar>
+              <w:top w:type="dxa" w:w="40"/>
+              <w:left w:type="dxa" w:w="80"/>
+              <w:bottom w:type="dxa" w:w="40"/>
+              <w:right w:type="dxa" w:w="80"/>
+            </w:tcMar>
+          </w:tcPr>
+          <w:p>
+            <w:pPr>
+              <w:spacing w:after="0"/>
+            </w:pPr>
+            <w:r>
+              <w:rPr>
+                <w:rFonts w:ascii="Calibri" w:cs="Calibri" w:eastAsia="Calibri" w:hAnsi="Calibri"/>
+                <w:b w:val="false"/>
+                <w:bCs w:val="false"/>
+                <w:sz w:val="14"/>
+                <w:szCs w:val="14"/>
+              </w:rPr>
+              <w:t xml:space="preserve">6. Once the pay items and quantities have been filled in, the Net Present Worth (NPW) table and summary graph below the pay items should be automatically filled in for the alternative. The “Summary” worksheet will also automatically fill with alternative costs as the individual alternative worksheets are completed. The Summary worksheet shows a results table for each alternative (initial construction, maintenance, rehabilitation, lost revenue and salvage present worth, net present worth, closure days), a line naming the lowest-cost alternative and whether it still wins at the FAA AIP rate of 7%, and five charts. It updates by itself whenever an input changes. Use the "View Summary" button under Alternative Setup to open it and the buttons at the top of the Summary to return.</w:t>
+            </w:r>
+          </w:p>
+        </w:tc>
+      </w:tr>
     </w:tbl>
     <w:p>
       <w:pPr>
@@ -6741,7 +6825,7 @@
                 <w:sz w:val="14"/>
                 <w:szCs w:val="14"/>
               </w:rPr>
-              <w:t xml:space="preserve">Database!A:D for the names; INDEX/MATCH on "Total" and "Net Present Worth"; SUMIFS over the NPW-table window (rows 37 to 52) on the row labels ("Maintenance*", "Rehabilitation*", "*Indirect*", "Salvage*"); closure days = sum of the by-year closure block (indirect cost / daily revenue, years within the analysis period), falling back to SUM of F4:F10 when lost revenue is off</w:t>
+              <w:t xml:space="preserve">INDEX(Database!A:A, row) etc. for the names (whole-column INDEX survives the Database row deletion the VBA performs when an alternative is removed; a fixed reference would become #REF!); INDEX/MATCH on "Total" and "Net Present Worth"; SUMIFS over the NPW-table window (rows 37 to 52) on the row labels ("Maintenance*", "Rehabilitation*", "*Indirect*", "Salvage*"); closure days = sum of the by-year closure block (indirect cost / daily revenue, years within the analysis period), falling back to SUM of F4:F10 when lost revenue is off</w:t>
             </w:r>
           </w:p>
         </w:tc>
@@ -10201,6 +10285,174 @@
                 <w:sz w:val="15"/>
                 <w:szCs w:val="15"/>
               </w:rPr>
+              <w:t xml:space="preserve">Scripted click-through, round 2</w:t>
+            </w:r>
+          </w:p>
+        </w:tc>
+        <w:tc>
+          <w:tcPr>
+            <w:tcW w:type="dxa" w:w="3000"/>
+            <w:tcMar>
+              <w:top w:type="dxa" w:w="40"/>
+              <w:left w:type="dxa" w:w="80"/>
+              <w:bottom w:type="dxa" w:w="40"/>
+              <w:right w:type="dxa" w:w="80"/>
+            </w:tcMar>
+          </w:tcPr>
+          <w:p>
+            <w:pPr>
+              <w:spacing w:after="0"/>
+            </w:pPr>
+            <w:r>
+              <w:rPr>
+                <w:rFonts w:ascii="Calibri" w:cs="Calibri" w:eastAsia="Calibri" w:hAnsi="Calibri"/>
+                <w:b w:val="false"/>
+                <w:bCs w:val="false"/>
+                <w:sz w:val="15"/>
+                <w:szCs w:val="15"/>
+              </w:rPr>
+              <w:t xml:space="preserve">Emulate the VBA Database row deletion; tie; four alternatives; airport dropdown; pay-item uniqueness; page setup (verification/uno_walkthrough_2.py, _3_delete_tie.py)</w:t>
+            </w:r>
+          </w:p>
+        </w:tc>
+        <w:tc>
+          <w:tcPr>
+            <w:tcW w:type="dxa" w:w="4060"/>
+            <w:tcMar>
+              <w:top w:type="dxa" w:w="40"/>
+              <w:left w:type="dxa" w:w="80"/>
+              <w:bottom w:type="dxa" w:w="40"/>
+              <w:right w:type="dxa" w:w="80"/>
+            </w:tcMar>
+          </w:tcPr>
+          <w:p>
+            <w:pPr>
+              <w:spacing w:after="0"/>
+            </w:pPr>
+            <w:r>
+              <w:rPr>
+                <w:rFonts w:ascii="Calibri" w:cs="Calibri" w:eastAsia="Calibri" w:hAnsi="Calibri"/>
+                <w:b w:val="false"/>
+                <w:bCs w:val="false"/>
+                <w:sz w:val="15"/>
+                <w:szCs w:val="15"/>
+              </w:rPr>
+              <w:t xml:space="preserve">Summary shifts up with no #REF!; tie reads "tied with the next alternative"; four rows and all chart blocks populate; dropdown has 79 airports, no blanks or duplicates; 56 unique pay-item descriptions; Summary prints landscape one page wide</w:t>
+            </w:r>
+          </w:p>
+        </w:tc>
+      </w:tr>
+      <w:tr>
+        <w:trPr>
+          <w:cantSplit/>
+          <w:tblHeader w:val="false"/>
+        </w:trPr>
+        <w:tc>
+          <w:tcPr>
+            <w:tcW w:type="dxa" w:w="2300"/>
+            <w:tcMar>
+              <w:top w:type="dxa" w:w="40"/>
+              <w:left w:type="dxa" w:w="80"/>
+              <w:bottom w:type="dxa" w:w="40"/>
+              <w:right w:type="dxa" w:w="80"/>
+            </w:tcMar>
+          </w:tcPr>
+          <w:p>
+            <w:pPr>
+              <w:spacing w:after="0"/>
+            </w:pPr>
+            <w:r>
+              <w:rPr>
+                <w:rFonts w:ascii="Calibri" w:cs="Calibri" w:eastAsia="Calibri" w:hAnsi="Calibri"/>
+                <w:b w:val="false"/>
+                <w:bCs w:val="false"/>
+                <w:sz w:val="15"/>
+                <w:szCs w:val="15"/>
+              </w:rPr>
+              <w:t xml:space="preserve">Package audit</w:t>
+            </w:r>
+          </w:p>
+        </w:tc>
+        <w:tc>
+          <w:tcPr>
+            <w:tcW w:type="dxa" w:w="3000"/>
+            <w:tcMar>
+              <w:top w:type="dxa" w:w="40"/>
+              <w:left w:type="dxa" w:w="80"/>
+              <w:bottom w:type="dxa" w:w="40"/>
+              <w:right w:type="dxa" w:w="80"/>
+            </w:tcMar>
+          </w:tcPr>
+          <w:p>
+            <w:pPr>
+              <w:spacing w:after="0"/>
+            </w:pPr>
+            <w:r>
+              <w:rPr>
+                <w:rFonts w:ascii="Calibri" w:cs="Calibri" w:eastAsia="Calibri" w:hAnsi="Calibri"/>
+                <w:b w:val="false"/>
+                <w:bCs w:val="false"/>
+                <w:sz w:val="15"/>
+                <w:szCs w:val="15"/>
+              </w:rPr>
+              <w:t xml:space="preserve">verification/audit_xml.py: cell and row order, style and shared-string counts, relationships, content types, defined names, selected tabs</w:t>
+            </w:r>
+          </w:p>
+        </w:tc>
+        <w:tc>
+          <w:tcPr>
+            <w:tcW w:type="dxa" w:w="4060"/>
+            <w:tcMar>
+              <w:top w:type="dxa" w:w="40"/>
+              <w:left w:type="dxa" w:w="80"/>
+              <w:bottom w:type="dxa" w:w="40"/>
+              <w:right w:type="dxa" w:w="80"/>
+            </w:tcMar>
+          </w:tcPr>
+          <w:p>
+            <w:pPr>
+              <w:spacing w:after="0"/>
+            </w:pPr>
+            <w:r>
+              <w:rPr>
+                <w:rFonts w:ascii="Calibri" w:cs="Calibri" w:eastAsia="Calibri" w:hAnsi="Calibri"/>
+                <w:b w:val="false"/>
+                <w:bCs w:val="false"/>
+                <w:sz w:val="15"/>
+                <w:szCs w:val="15"/>
+              </w:rPr>
+              <w:t xml:space="preserve">No issues; one selected tab (General Information); v1.1.2 shows the calcChain and three external Airport_Name names</w:t>
+            </w:r>
+          </w:p>
+        </w:tc>
+      </w:tr>
+      <w:tr>
+        <w:trPr>
+          <w:cantSplit/>
+          <w:tblHeader w:val="false"/>
+        </w:trPr>
+        <w:tc>
+          <w:tcPr>
+            <w:tcW w:type="dxa" w:w="2300"/>
+            <w:tcMar>
+              <w:top w:type="dxa" w:w="40"/>
+              <w:left w:type="dxa" w:w="80"/>
+              <w:bottom w:type="dxa" w:w="40"/>
+              <w:right w:type="dxa" w:w="80"/>
+            </w:tcMar>
+          </w:tcPr>
+          <w:p>
+            <w:pPr>
+              <w:spacing w:after="0"/>
+            </w:pPr>
+            <w:r>
+              <w:rPr>
+                <w:rFonts w:ascii="Calibri" w:cs="Calibri" w:eastAsia="Calibri" w:hAnsi="Calibri"/>
+                <w:b w:val="false"/>
+                <w:bCs w:val="false"/>
+                <w:sz w:val="15"/>
+                <w:szCs w:val="15"/>
+              </w:rPr>
               <w:t xml:space="preserve">Not verified in this environment</w:t>
             </w:r>
           </w:p>
@@ -22409,7 +22661,7 @@
                 <w:sz w:val="12"/>
                 <w:szCs w:val="12"/>
               </w:rPr>
-              <w:t xml:space="preserve">=IF(Database!$D$4="","",Database!$D$4)</w:t>
+              <w:t xml:space="preserve">=IF(INDEX(Database!$D:$D,4)="","",INDEX(Database!$D:$D,4))</w:t>
             </w:r>
           </w:p>
         </w:tc>
@@ -22467,7 +22719,7 @@
                 <w:sz w:val="12"/>
                 <w:szCs w:val="12"/>
               </w:rPr>
-              <w:t xml:space="preserve">=IF($G4="","",Database!$A$4)</w:t>
+              <w:t xml:space="preserve">=IF($G4="","",INDEX(Database!$A:$A,4))</w:t>
             </w:r>
           </w:p>
         </w:tc>
@@ -22525,7 +22777,7 @@
                 <w:sz w:val="12"/>
                 <w:szCs w:val="12"/>
               </w:rPr>
-              <w:t xml:space="preserve">=IF($G4="","",Database!$B$4)</w:t>
+              <w:t xml:space="preserve">=IF($G4="","",INDEX(Database!$B:$B,4))</w:t>
             </w:r>
           </w:p>
         </w:tc>
@@ -23105,7 +23357,7 @@
                 <w:sz w:val="12"/>
                 <w:szCs w:val="12"/>
               </w:rPr>
-              <w:t xml:space="preserve">=IF(COUNT($O$4:$O$7)=0,"No alternatives yet. Go to General Information and click Alternative Setup.","Lowest present worth: "&amp;INDEX($H$4:$H$7,MATCH(MIN($O$4:$O$7),$O$4:$O$7,0))&amp;IF(COUNT($O$4:$O$7)&lt;2,"   |   only one alternative so far","   |   margin to next: "&amp;TEXT(SMALL($O$4:$O$7,2)-MIN($O$4:$O$7),"$#,##0"))&amp;"   |   "&amp;'General Information'!$D$34&amp;"% over "&amp;'General Information'!$D$33&amp;" years   |   lost revenue: "&amp;'General Information'!$D$38)</w:t>
+              <w:t xml:space="preserve">=IF(COUNT($O$4:$O$7)=0,"No alternatives yet. Go to General Information and click Alternative Setup.","Lowest present worth: "&amp;INDEX($H$4:$H$7,MATCH(MIN($O$4:$O$7),$O$4:$O$7,0))&amp;IF(COUNT($O$4:$O$7)&lt;2,"   |   only one alternative so far",IF(SMALL($O$4:$O$7,2)=MIN($O$4:$O$7),"   |   tied with the next alternative","   |   margin to next: "&amp;TEXT(SMALL($O$4:$O$7,2)-MIN($O$4:$O$7),"$#,##0")))&amp;"   |   "&amp;'General Information'!$D$34&amp;"% over "&amp;'General Information'!$D$33&amp;" years   |   lost revenue: "&amp;'General Information'!$D$38)</w:t>
             </w:r>
           </w:p>
         </w:tc>

</xml_diff>